<commit_message>
feat(ariza): auto-fill issuing court from picked court; case number as manual blank
For all ariza templates:
1. «Қарор чиқарган суд» / «Иш қаралган суд» (lower_court_name /
   issuing_court_name) is no longer asked — it carries the court the
   user already selected. For the iqtisodiy appellate/cassation forms
   the appeal target is now derived from the region (court_name), so the
   picked court is correctly the lower/issuing court.
2. «Иш рақами» (case_number) is no longer asked — rendered as a manual
   fill-in blank (____) on the printed form.

Both are set centrally in DocumentService.build, so the bot and the
mini app behave identically. Removed the now-unused fields from 6
templates; updated appellate instructions (select the issuing court,
not the regional one) and regenerated the iqtisodiy appellate/cassation
.docx headers.

Co-Authored-By: Claude Opus 4.8 (1M context) <noreply@anthropic.com>
</commit_message>
<xml_diff>
--- a/templates/shikoyat-iqtisodiy-apellyatsiya.ru.docx
+++ b/templates/shikoyat-iqtisodiy-apellyatsiya.ru.docx
@@ -18,7 +18,7 @@
           <w:sz w:val="24"/>
           <w:szCs w:val="24"/>
         </w:rPr>
-        <w:t xml:space="preserve">В апелляционную инстанцию по экономическим</w:t>
+        <w:t xml:space="preserve">В апелляционную инстанцию по экономическим делам</w:t>
       </w:r>
     </w:p>
     <w:p>
@@ -37,7 +37,7 @@
           <w:sz w:val="24"/>
           <w:szCs w:val="24"/>
         </w:rPr>
-        <w:t xml:space="preserve">делам {{district_court_name}}</w:t>
+        <w:t xml:space="preserve">областного суда {{court_name}}</w:t>
       </w:r>
     </w:p>
     <w:p>

</xml_diff>